<commit_message>
add help page and git
</commit_message>
<xml_diff>
--- a/Ticket/生徒.docx
+++ b/Ticket/生徒.docx
@@ -7602,7 +7602,17 @@
                                   <w:szCs w:val="18"/>
                                   <w:lang w:eastAsia="zh-CN"/>
                                 </w:rPr>
-                                <w:t>V0.1.1</w:t>
+                                <w:t>V</w:t>
+                              </w:r>
+                              <w:r>
+                                <w:rPr>
+                                  <w:rFonts w:ascii="IBM Plex Sans JP" w:eastAsia="IBM Plex Sans JP" w:hAnsi="IBM Plex Sans JP"/>
+                                  <w:color w:val="000000" w:themeColor="text1"/>
+                                  <w:sz w:val="16"/>
+                                  <w:szCs w:val="18"/>
+                                  <w:lang w:eastAsia="zh-CN"/>
+                                </w:rPr>
+                                <w:t>1.1</w:t>
                               </w:r>
                               <w:r>
                                 <w:rPr>
@@ -7756,7 +7766,43 @@
                                   <w:sz w:val="16"/>
                                   <w:szCs w:val="18"/>
                                 </w:rPr>
-                                <w:t>投票の際は終了時刻にご注意ください。(詳しくはパンフレットを参照。</w:t>
+                                <w:t>投票の際は</w:t>
+                              </w:r>
+                              <w:r>
+                                <w:rPr>
+                                  <w:rFonts w:ascii="IBM Plex Sans JP" w:eastAsia="IBM Plex Sans JP" w:hAnsi="IBM Plex Sans JP" w:hint="eastAsia"/>
+                                  <w:color w:val="000000" w:themeColor="text1"/>
+                                  <w:sz w:val="16"/>
+                                  <w:szCs w:val="18"/>
+                                </w:rPr>
+                                <w:t>時刻</w:t>
+                              </w:r>
+                              <w:r>
+                                <w:rPr>
+                                  <w:rFonts w:ascii="IBM Plex Sans JP" w:eastAsia="IBM Plex Sans JP" w:hAnsi="IBM Plex Sans JP" w:hint="eastAsia"/>
+                                  <w:color w:val="000000" w:themeColor="text1"/>
+                                  <w:sz w:val="16"/>
+                                  <w:szCs w:val="18"/>
+                                </w:rPr>
+                                <w:t>にご注意ください。(詳しくはパンフレット</w:t>
+                              </w:r>
+                              <w:r>
+                                <w:rPr>
+                                  <w:rFonts w:ascii="IBM Plex Sans JP" w:eastAsia="IBM Plex Sans JP" w:hAnsi="IBM Plex Sans JP" w:hint="eastAsia"/>
+                                  <w:color w:val="000000" w:themeColor="text1"/>
+                                  <w:sz w:val="16"/>
+                                  <w:szCs w:val="18"/>
+                                </w:rPr>
+                                <w:t>p.31</w:t>
+                              </w:r>
+                              <w:r>
+                                <w:rPr>
+                                  <w:rFonts w:ascii="IBM Plex Sans JP" w:eastAsia="IBM Plex Sans JP" w:hAnsi="IBM Plex Sans JP" w:hint="eastAsia"/>
+                                  <w:color w:val="000000" w:themeColor="text1"/>
+                                  <w:sz w:val="16"/>
+                                  <w:szCs w:val="18"/>
+                                </w:rPr>
+                                <w:t>を参照。</w:t>
                               </w:r>
                               <w:r>
                                 <w:rPr>
@@ -7875,7 +7921,17 @@
                             <w:szCs w:val="18"/>
                             <w:lang w:eastAsia="zh-CN"/>
                           </w:rPr>
-                          <w:t>V0.1.1</w:t>
+                          <w:t>V</w:t>
+                        </w:r>
+                        <w:r>
+                          <w:rPr>
+                            <w:rFonts w:ascii="IBM Plex Sans JP" w:eastAsia="IBM Plex Sans JP" w:hAnsi="IBM Plex Sans JP"/>
+                            <w:color w:val="000000" w:themeColor="text1"/>
+                            <w:sz w:val="16"/>
+                            <w:szCs w:val="18"/>
+                            <w:lang w:eastAsia="zh-CN"/>
+                          </w:rPr>
+                          <w:t>1.1</w:t>
                         </w:r>
                         <w:r>
                           <w:rPr>
@@ -8008,7 +8064,43 @@
                             <w:sz w:val="16"/>
                             <w:szCs w:val="18"/>
                           </w:rPr>
-                          <w:t>投票の際は終了時刻にご注意ください。(詳しくはパンフレットを参照。</w:t>
+                          <w:t>投票の際は</w:t>
+                        </w:r>
+                        <w:r>
+                          <w:rPr>
+                            <w:rFonts w:ascii="IBM Plex Sans JP" w:eastAsia="IBM Plex Sans JP" w:hAnsi="IBM Plex Sans JP" w:hint="eastAsia"/>
+                            <w:color w:val="000000" w:themeColor="text1"/>
+                            <w:sz w:val="16"/>
+                            <w:szCs w:val="18"/>
+                          </w:rPr>
+                          <w:t>時刻</w:t>
+                        </w:r>
+                        <w:r>
+                          <w:rPr>
+                            <w:rFonts w:ascii="IBM Plex Sans JP" w:eastAsia="IBM Plex Sans JP" w:hAnsi="IBM Plex Sans JP" w:hint="eastAsia"/>
+                            <w:color w:val="000000" w:themeColor="text1"/>
+                            <w:sz w:val="16"/>
+                            <w:szCs w:val="18"/>
+                          </w:rPr>
+                          <w:t>にご注意ください。(詳しくはパンフレット</w:t>
+                        </w:r>
+                        <w:r>
+                          <w:rPr>
+                            <w:rFonts w:ascii="IBM Plex Sans JP" w:eastAsia="IBM Plex Sans JP" w:hAnsi="IBM Plex Sans JP" w:hint="eastAsia"/>
+                            <w:color w:val="000000" w:themeColor="text1"/>
+                            <w:sz w:val="16"/>
+                            <w:szCs w:val="18"/>
+                          </w:rPr>
+                          <w:t>p.31</w:t>
+                        </w:r>
+                        <w:r>
+                          <w:rPr>
+                            <w:rFonts w:ascii="IBM Plex Sans JP" w:eastAsia="IBM Plex Sans JP" w:hAnsi="IBM Plex Sans JP" w:hint="eastAsia"/>
+                            <w:color w:val="000000" w:themeColor="text1"/>
+                            <w:sz w:val="16"/>
+                            <w:szCs w:val="18"/>
+                          </w:rPr>
+                          <w:t>を参照。</w:t>
                         </w:r>
                         <w:r>
                           <w:rPr>
@@ -8222,7 +8314,17 @@
                                   <w:szCs w:val="18"/>
                                   <w:lang w:eastAsia="zh-CN"/>
                                 </w:rPr>
-                                <w:t>V0.1.1</w:t>
+                                <w:t>V</w:t>
+                              </w:r>
+                              <w:r>
+                                <w:rPr>
+                                  <w:rFonts w:ascii="IBM Plex Sans JP" w:eastAsia="IBM Plex Sans JP" w:hAnsi="IBM Plex Sans JP"/>
+                                  <w:color w:val="000000" w:themeColor="text1"/>
+                                  <w:sz w:val="16"/>
+                                  <w:szCs w:val="18"/>
+                                  <w:lang w:eastAsia="zh-CN"/>
+                                </w:rPr>
+                                <w:t>1.1</w:t>
                               </w:r>
                               <w:r>
                                 <w:rPr>
@@ -8376,7 +8478,43 @@
                                   <w:sz w:val="16"/>
                                   <w:szCs w:val="18"/>
                                 </w:rPr>
-                                <w:t>投票の際は終了時刻にご注意ください。(詳しくはパンフレットを参照。</w:t>
+                                <w:t>投票の際は</w:t>
+                              </w:r>
+                              <w:r>
+                                <w:rPr>
+                                  <w:rFonts w:ascii="IBM Plex Sans JP" w:eastAsia="IBM Plex Sans JP" w:hAnsi="IBM Plex Sans JP" w:hint="eastAsia"/>
+                                  <w:color w:val="000000" w:themeColor="text1"/>
+                                  <w:sz w:val="16"/>
+                                  <w:szCs w:val="18"/>
+                                </w:rPr>
+                                <w:t>時刻</w:t>
+                              </w:r>
+                              <w:r>
+                                <w:rPr>
+                                  <w:rFonts w:ascii="IBM Plex Sans JP" w:eastAsia="IBM Plex Sans JP" w:hAnsi="IBM Plex Sans JP" w:hint="eastAsia"/>
+                                  <w:color w:val="000000" w:themeColor="text1"/>
+                                  <w:sz w:val="16"/>
+                                  <w:szCs w:val="18"/>
+                                </w:rPr>
+                                <w:t>にご注意ください。(詳しくはパンフレットを</w:t>
+                              </w:r>
+                              <w:r>
+                                <w:rPr>
+                                  <w:rFonts w:ascii="IBM Plex Sans JP" w:eastAsia="IBM Plex Sans JP" w:hAnsi="IBM Plex Sans JP" w:hint="eastAsia"/>
+                                  <w:color w:val="000000" w:themeColor="text1"/>
+                                  <w:sz w:val="16"/>
+                                  <w:szCs w:val="18"/>
+                                </w:rPr>
+                                <w:t>p.31</w:t>
+                              </w:r>
+                              <w:r>
+                                <w:rPr>
+                                  <w:rFonts w:ascii="IBM Plex Sans JP" w:eastAsia="IBM Plex Sans JP" w:hAnsi="IBM Plex Sans JP" w:hint="eastAsia"/>
+                                  <w:color w:val="000000" w:themeColor="text1"/>
+                                  <w:sz w:val="16"/>
+                                  <w:szCs w:val="18"/>
+                                </w:rPr>
+                                <w:t>参照。</w:t>
                               </w:r>
                               <w:r>
                                 <w:rPr>
@@ -8495,7 +8633,17 @@
                             <w:szCs w:val="18"/>
                             <w:lang w:eastAsia="zh-CN"/>
                           </w:rPr>
-                          <w:t>V0.1.1</w:t>
+                          <w:t>V</w:t>
+                        </w:r>
+                        <w:r>
+                          <w:rPr>
+                            <w:rFonts w:ascii="IBM Plex Sans JP" w:eastAsia="IBM Plex Sans JP" w:hAnsi="IBM Plex Sans JP"/>
+                            <w:color w:val="000000" w:themeColor="text1"/>
+                            <w:sz w:val="16"/>
+                            <w:szCs w:val="18"/>
+                            <w:lang w:eastAsia="zh-CN"/>
+                          </w:rPr>
+                          <w:t>1.1</w:t>
                         </w:r>
                         <w:r>
                           <w:rPr>
@@ -8628,7 +8776,43 @@
                             <w:sz w:val="16"/>
                             <w:szCs w:val="18"/>
                           </w:rPr>
-                          <w:t>投票の際は終了時刻にご注意ください。(詳しくはパンフレットを参照。</w:t>
+                          <w:t>投票の際は</w:t>
+                        </w:r>
+                        <w:r>
+                          <w:rPr>
+                            <w:rFonts w:ascii="IBM Plex Sans JP" w:eastAsia="IBM Plex Sans JP" w:hAnsi="IBM Plex Sans JP" w:hint="eastAsia"/>
+                            <w:color w:val="000000" w:themeColor="text1"/>
+                            <w:sz w:val="16"/>
+                            <w:szCs w:val="18"/>
+                          </w:rPr>
+                          <w:t>時刻</w:t>
+                        </w:r>
+                        <w:r>
+                          <w:rPr>
+                            <w:rFonts w:ascii="IBM Plex Sans JP" w:eastAsia="IBM Plex Sans JP" w:hAnsi="IBM Plex Sans JP" w:hint="eastAsia"/>
+                            <w:color w:val="000000" w:themeColor="text1"/>
+                            <w:sz w:val="16"/>
+                            <w:szCs w:val="18"/>
+                          </w:rPr>
+                          <w:t>にご注意ください。(詳しくはパンフレットを</w:t>
+                        </w:r>
+                        <w:r>
+                          <w:rPr>
+                            <w:rFonts w:ascii="IBM Plex Sans JP" w:eastAsia="IBM Plex Sans JP" w:hAnsi="IBM Plex Sans JP" w:hint="eastAsia"/>
+                            <w:color w:val="000000" w:themeColor="text1"/>
+                            <w:sz w:val="16"/>
+                            <w:szCs w:val="18"/>
+                          </w:rPr>
+                          <w:t>p.31</w:t>
+                        </w:r>
+                        <w:r>
+                          <w:rPr>
+                            <w:rFonts w:ascii="IBM Plex Sans JP" w:eastAsia="IBM Plex Sans JP" w:hAnsi="IBM Plex Sans JP" w:hint="eastAsia"/>
+                            <w:color w:val="000000" w:themeColor="text1"/>
+                            <w:sz w:val="16"/>
+                            <w:szCs w:val="18"/>
+                          </w:rPr>
+                          <w:t>参照。</w:t>
                         </w:r>
                         <w:r>
                           <w:rPr>
@@ -8842,7 +9026,17 @@
                                   <w:szCs w:val="18"/>
                                   <w:lang w:eastAsia="zh-CN"/>
                                 </w:rPr>
-                                <w:t>V0.1.1</w:t>
+                                <w:t>V</w:t>
+                              </w:r>
+                              <w:r>
+                                <w:rPr>
+                                  <w:rFonts w:ascii="IBM Plex Sans JP" w:eastAsia="IBM Plex Sans JP" w:hAnsi="IBM Plex Sans JP"/>
+                                  <w:color w:val="000000" w:themeColor="text1"/>
+                                  <w:sz w:val="16"/>
+                                  <w:szCs w:val="18"/>
+                                  <w:lang w:eastAsia="zh-CN"/>
+                                </w:rPr>
+                                <w:t>1.1</w:t>
                               </w:r>
                               <w:r>
                                 <w:rPr>
@@ -8996,7 +9190,43 @@
                                   <w:sz w:val="16"/>
                                   <w:szCs w:val="18"/>
                                 </w:rPr>
-                                <w:t>投票の際は終了時刻にご注意ください。(詳しくはパンフレットを参照。</w:t>
+                                <w:t>投票の際は</w:t>
+                              </w:r>
+                              <w:r>
+                                <w:rPr>
+                                  <w:rFonts w:ascii="IBM Plex Sans JP" w:eastAsia="IBM Plex Sans JP" w:hAnsi="IBM Plex Sans JP" w:hint="eastAsia"/>
+                                  <w:color w:val="000000" w:themeColor="text1"/>
+                                  <w:sz w:val="16"/>
+                                  <w:szCs w:val="18"/>
+                                </w:rPr>
+                                <w:t>時刻</w:t>
+                              </w:r>
+                              <w:r>
+                                <w:rPr>
+                                  <w:rFonts w:ascii="IBM Plex Sans JP" w:eastAsia="IBM Plex Sans JP" w:hAnsi="IBM Plex Sans JP" w:hint="eastAsia"/>
+                                  <w:color w:val="000000" w:themeColor="text1"/>
+                                  <w:sz w:val="16"/>
+                                  <w:szCs w:val="18"/>
+                                </w:rPr>
+                                <w:t>にご注意ください。(詳しくはパンフレットを</w:t>
+                              </w:r>
+                              <w:r>
+                                <w:rPr>
+                                  <w:rFonts w:ascii="IBM Plex Sans JP" w:eastAsia="IBM Plex Sans JP" w:hAnsi="IBM Plex Sans JP" w:hint="eastAsia"/>
+                                  <w:color w:val="000000" w:themeColor="text1"/>
+                                  <w:sz w:val="16"/>
+                                  <w:szCs w:val="18"/>
+                                </w:rPr>
+                                <w:t>p.31</w:t>
+                              </w:r>
+                              <w:r>
+                                <w:rPr>
+                                  <w:rFonts w:ascii="IBM Plex Sans JP" w:eastAsia="IBM Plex Sans JP" w:hAnsi="IBM Plex Sans JP" w:hint="eastAsia"/>
+                                  <w:color w:val="000000" w:themeColor="text1"/>
+                                  <w:sz w:val="16"/>
+                                  <w:szCs w:val="18"/>
+                                </w:rPr>
+                                <w:t>参照。</w:t>
                               </w:r>
                               <w:r>
                                 <w:rPr>
@@ -9115,7 +9345,17 @@
                             <w:szCs w:val="18"/>
                             <w:lang w:eastAsia="zh-CN"/>
                           </w:rPr>
-                          <w:t>V0.1.1</w:t>
+                          <w:t>V</w:t>
+                        </w:r>
+                        <w:r>
+                          <w:rPr>
+                            <w:rFonts w:ascii="IBM Plex Sans JP" w:eastAsia="IBM Plex Sans JP" w:hAnsi="IBM Plex Sans JP"/>
+                            <w:color w:val="000000" w:themeColor="text1"/>
+                            <w:sz w:val="16"/>
+                            <w:szCs w:val="18"/>
+                            <w:lang w:eastAsia="zh-CN"/>
+                          </w:rPr>
+                          <w:t>1.1</w:t>
                         </w:r>
                         <w:r>
                           <w:rPr>
@@ -9248,7 +9488,43 @@
                             <w:sz w:val="16"/>
                             <w:szCs w:val="18"/>
                           </w:rPr>
-                          <w:t>投票の際は終了時刻にご注意ください。(詳しくはパンフレットを参照。</w:t>
+                          <w:t>投票の際は</w:t>
+                        </w:r>
+                        <w:r>
+                          <w:rPr>
+                            <w:rFonts w:ascii="IBM Plex Sans JP" w:eastAsia="IBM Plex Sans JP" w:hAnsi="IBM Plex Sans JP" w:hint="eastAsia"/>
+                            <w:color w:val="000000" w:themeColor="text1"/>
+                            <w:sz w:val="16"/>
+                            <w:szCs w:val="18"/>
+                          </w:rPr>
+                          <w:t>時刻</w:t>
+                        </w:r>
+                        <w:r>
+                          <w:rPr>
+                            <w:rFonts w:ascii="IBM Plex Sans JP" w:eastAsia="IBM Plex Sans JP" w:hAnsi="IBM Plex Sans JP" w:hint="eastAsia"/>
+                            <w:color w:val="000000" w:themeColor="text1"/>
+                            <w:sz w:val="16"/>
+                            <w:szCs w:val="18"/>
+                          </w:rPr>
+                          <w:t>にご注意ください。(詳しくはパンフレットを</w:t>
+                        </w:r>
+                        <w:r>
+                          <w:rPr>
+                            <w:rFonts w:ascii="IBM Plex Sans JP" w:eastAsia="IBM Plex Sans JP" w:hAnsi="IBM Plex Sans JP" w:hint="eastAsia"/>
+                            <w:color w:val="000000" w:themeColor="text1"/>
+                            <w:sz w:val="16"/>
+                            <w:szCs w:val="18"/>
+                          </w:rPr>
+                          <w:t>p.31</w:t>
+                        </w:r>
+                        <w:r>
+                          <w:rPr>
+                            <w:rFonts w:ascii="IBM Plex Sans JP" w:eastAsia="IBM Plex Sans JP" w:hAnsi="IBM Plex Sans JP" w:hint="eastAsia"/>
+                            <w:color w:val="000000" w:themeColor="text1"/>
+                            <w:sz w:val="16"/>
+                            <w:szCs w:val="18"/>
+                          </w:rPr>
+                          <w:t>参照。</w:t>
                         </w:r>
                         <w:r>
                           <w:rPr>
@@ -9462,7 +9738,17 @@
                                   <w:szCs w:val="18"/>
                                   <w:lang w:eastAsia="zh-CN"/>
                                 </w:rPr>
-                                <w:t>V0.1.1</w:t>
+                                <w:t>V</w:t>
+                              </w:r>
+                              <w:r>
+                                <w:rPr>
+                                  <w:rFonts w:ascii="IBM Plex Sans JP" w:eastAsia="IBM Plex Sans JP" w:hAnsi="IBM Plex Sans JP"/>
+                                  <w:color w:val="000000" w:themeColor="text1"/>
+                                  <w:sz w:val="16"/>
+                                  <w:szCs w:val="18"/>
+                                  <w:lang w:eastAsia="zh-CN"/>
+                                </w:rPr>
+                                <w:t>1.1</w:t>
                               </w:r>
                               <w:r>
                                 <w:rPr>
@@ -9616,7 +9902,43 @@
                                   <w:sz w:val="16"/>
                                   <w:szCs w:val="18"/>
                                 </w:rPr>
-                                <w:t>投票の際は終了時刻にご注意ください。(詳しくはパンフレットを参照。</w:t>
+                                <w:t>投票の際は</w:t>
+                              </w:r>
+                              <w:r>
+                                <w:rPr>
+                                  <w:rFonts w:ascii="IBM Plex Sans JP" w:eastAsia="IBM Plex Sans JP" w:hAnsi="IBM Plex Sans JP" w:hint="eastAsia"/>
+                                  <w:color w:val="000000" w:themeColor="text1"/>
+                                  <w:sz w:val="16"/>
+                                  <w:szCs w:val="18"/>
+                                </w:rPr>
+                                <w:t>時刻</w:t>
+                              </w:r>
+                              <w:r>
+                                <w:rPr>
+                                  <w:rFonts w:ascii="IBM Plex Sans JP" w:eastAsia="IBM Plex Sans JP" w:hAnsi="IBM Plex Sans JP" w:hint="eastAsia"/>
+                                  <w:color w:val="000000" w:themeColor="text1"/>
+                                  <w:sz w:val="16"/>
+                                  <w:szCs w:val="18"/>
+                                </w:rPr>
+                                <w:t>にご注意ください。(詳しくはパンフレットを</w:t>
+                              </w:r>
+                              <w:r>
+                                <w:rPr>
+                                  <w:rFonts w:ascii="IBM Plex Sans JP" w:eastAsia="IBM Plex Sans JP" w:hAnsi="IBM Plex Sans JP" w:hint="eastAsia"/>
+                                  <w:color w:val="000000" w:themeColor="text1"/>
+                                  <w:sz w:val="16"/>
+                                  <w:szCs w:val="18"/>
+                                </w:rPr>
+                                <w:t>p.31</w:t>
+                              </w:r>
+                              <w:r>
+                                <w:rPr>
+                                  <w:rFonts w:ascii="IBM Plex Sans JP" w:eastAsia="IBM Plex Sans JP" w:hAnsi="IBM Plex Sans JP" w:hint="eastAsia"/>
+                                  <w:color w:val="000000" w:themeColor="text1"/>
+                                  <w:sz w:val="16"/>
+                                  <w:szCs w:val="18"/>
+                                </w:rPr>
+                                <w:t>参照。</w:t>
                               </w:r>
                               <w:r>
                                 <w:rPr>
@@ -9735,7 +10057,17 @@
                             <w:szCs w:val="18"/>
                             <w:lang w:eastAsia="zh-CN"/>
                           </w:rPr>
-                          <w:t>V0.1.1</w:t>
+                          <w:t>V</w:t>
+                        </w:r>
+                        <w:r>
+                          <w:rPr>
+                            <w:rFonts w:ascii="IBM Plex Sans JP" w:eastAsia="IBM Plex Sans JP" w:hAnsi="IBM Plex Sans JP"/>
+                            <w:color w:val="000000" w:themeColor="text1"/>
+                            <w:sz w:val="16"/>
+                            <w:szCs w:val="18"/>
+                            <w:lang w:eastAsia="zh-CN"/>
+                          </w:rPr>
+                          <w:t>1.1</w:t>
                         </w:r>
                         <w:r>
                           <w:rPr>
@@ -9868,7 +10200,43 @@
                             <w:sz w:val="16"/>
                             <w:szCs w:val="18"/>
                           </w:rPr>
-                          <w:t>投票の際は終了時刻にご注意ください。(詳しくはパンフレットを参照。</w:t>
+                          <w:t>投票の際は</w:t>
+                        </w:r>
+                        <w:r>
+                          <w:rPr>
+                            <w:rFonts w:ascii="IBM Plex Sans JP" w:eastAsia="IBM Plex Sans JP" w:hAnsi="IBM Plex Sans JP" w:hint="eastAsia"/>
+                            <w:color w:val="000000" w:themeColor="text1"/>
+                            <w:sz w:val="16"/>
+                            <w:szCs w:val="18"/>
+                          </w:rPr>
+                          <w:t>時刻</w:t>
+                        </w:r>
+                        <w:r>
+                          <w:rPr>
+                            <w:rFonts w:ascii="IBM Plex Sans JP" w:eastAsia="IBM Plex Sans JP" w:hAnsi="IBM Plex Sans JP" w:hint="eastAsia"/>
+                            <w:color w:val="000000" w:themeColor="text1"/>
+                            <w:sz w:val="16"/>
+                            <w:szCs w:val="18"/>
+                          </w:rPr>
+                          <w:t>にご注意ください。(詳しくはパンフレットを</w:t>
+                        </w:r>
+                        <w:r>
+                          <w:rPr>
+                            <w:rFonts w:ascii="IBM Plex Sans JP" w:eastAsia="IBM Plex Sans JP" w:hAnsi="IBM Plex Sans JP" w:hint="eastAsia"/>
+                            <w:color w:val="000000" w:themeColor="text1"/>
+                            <w:sz w:val="16"/>
+                            <w:szCs w:val="18"/>
+                          </w:rPr>
+                          <w:t>p.31</w:t>
+                        </w:r>
+                        <w:r>
+                          <w:rPr>
+                            <w:rFonts w:ascii="IBM Plex Sans JP" w:eastAsia="IBM Plex Sans JP" w:hAnsi="IBM Plex Sans JP" w:hint="eastAsia"/>
+                            <w:color w:val="000000" w:themeColor="text1"/>
+                            <w:sz w:val="16"/>
+                            <w:szCs w:val="18"/>
+                          </w:rPr>
+                          <w:t>参照。</w:t>
                         </w:r>
                         <w:r>
                           <w:rPr>
@@ -10082,7 +10450,17 @@
                                   <w:szCs w:val="18"/>
                                   <w:lang w:eastAsia="zh-CN"/>
                                 </w:rPr>
-                                <w:t>V0.1.1</w:t>
+                                <w:t>V</w:t>
+                              </w:r>
+                              <w:r>
+                                <w:rPr>
+                                  <w:rFonts w:ascii="IBM Plex Sans JP" w:eastAsia="IBM Plex Sans JP" w:hAnsi="IBM Plex Sans JP"/>
+                                  <w:color w:val="000000" w:themeColor="text1"/>
+                                  <w:sz w:val="16"/>
+                                  <w:szCs w:val="18"/>
+                                  <w:lang w:eastAsia="zh-CN"/>
+                                </w:rPr>
+                                <w:t>1.1</w:t>
                               </w:r>
                               <w:r>
                                 <w:rPr>
@@ -10236,7 +10614,43 @@
                                   <w:sz w:val="16"/>
                                   <w:szCs w:val="18"/>
                                 </w:rPr>
-                                <w:t>投票の際は終了時刻にご注意ください。(詳しくはパンフレットを参照。</w:t>
+                                <w:t>投票の際は</w:t>
+                              </w:r>
+                              <w:r>
+                                <w:rPr>
+                                  <w:rFonts w:ascii="IBM Plex Sans JP" w:eastAsia="IBM Plex Sans JP" w:hAnsi="IBM Plex Sans JP" w:hint="eastAsia"/>
+                                  <w:color w:val="000000" w:themeColor="text1"/>
+                                  <w:sz w:val="16"/>
+                                  <w:szCs w:val="18"/>
+                                </w:rPr>
+                                <w:t>時刻</w:t>
+                              </w:r>
+                              <w:r>
+                                <w:rPr>
+                                  <w:rFonts w:ascii="IBM Plex Sans JP" w:eastAsia="IBM Plex Sans JP" w:hAnsi="IBM Plex Sans JP" w:hint="eastAsia"/>
+                                  <w:color w:val="000000" w:themeColor="text1"/>
+                                  <w:sz w:val="16"/>
+                                  <w:szCs w:val="18"/>
+                                </w:rPr>
+                                <w:t>にご注意ください。(詳しくはパンフレット</w:t>
+                              </w:r>
+                              <w:r>
+                                <w:rPr>
+                                  <w:rFonts w:ascii="IBM Plex Sans JP" w:eastAsia="IBM Plex Sans JP" w:hAnsi="IBM Plex Sans JP" w:hint="eastAsia"/>
+                                  <w:color w:val="000000" w:themeColor="text1"/>
+                                  <w:sz w:val="16"/>
+                                  <w:szCs w:val="18"/>
+                                </w:rPr>
+                                <w:t>p.31</w:t>
+                              </w:r>
+                              <w:r>
+                                <w:rPr>
+                                  <w:rFonts w:ascii="IBM Plex Sans JP" w:eastAsia="IBM Plex Sans JP" w:hAnsi="IBM Plex Sans JP" w:hint="eastAsia"/>
+                                  <w:color w:val="000000" w:themeColor="text1"/>
+                                  <w:sz w:val="16"/>
+                                  <w:szCs w:val="18"/>
+                                </w:rPr>
+                                <w:t>を参照。</w:t>
                               </w:r>
                               <w:r>
                                 <w:rPr>
@@ -10355,7 +10769,17 @@
                             <w:szCs w:val="18"/>
                             <w:lang w:eastAsia="zh-CN"/>
                           </w:rPr>
-                          <w:t>V0.1.1</w:t>
+                          <w:t>V</w:t>
+                        </w:r>
+                        <w:r>
+                          <w:rPr>
+                            <w:rFonts w:ascii="IBM Plex Sans JP" w:eastAsia="IBM Plex Sans JP" w:hAnsi="IBM Plex Sans JP"/>
+                            <w:color w:val="000000" w:themeColor="text1"/>
+                            <w:sz w:val="16"/>
+                            <w:szCs w:val="18"/>
+                            <w:lang w:eastAsia="zh-CN"/>
+                          </w:rPr>
+                          <w:t>1.1</w:t>
                         </w:r>
                         <w:r>
                           <w:rPr>
@@ -10488,7 +10912,43 @@
                             <w:sz w:val="16"/>
                             <w:szCs w:val="18"/>
                           </w:rPr>
-                          <w:t>投票の際は終了時刻にご注意ください。(詳しくはパンフレットを参照。</w:t>
+                          <w:t>投票の際は</w:t>
+                        </w:r>
+                        <w:r>
+                          <w:rPr>
+                            <w:rFonts w:ascii="IBM Plex Sans JP" w:eastAsia="IBM Plex Sans JP" w:hAnsi="IBM Plex Sans JP" w:hint="eastAsia"/>
+                            <w:color w:val="000000" w:themeColor="text1"/>
+                            <w:sz w:val="16"/>
+                            <w:szCs w:val="18"/>
+                          </w:rPr>
+                          <w:t>時刻</w:t>
+                        </w:r>
+                        <w:r>
+                          <w:rPr>
+                            <w:rFonts w:ascii="IBM Plex Sans JP" w:eastAsia="IBM Plex Sans JP" w:hAnsi="IBM Plex Sans JP" w:hint="eastAsia"/>
+                            <w:color w:val="000000" w:themeColor="text1"/>
+                            <w:sz w:val="16"/>
+                            <w:szCs w:val="18"/>
+                          </w:rPr>
+                          <w:t>にご注意ください。(詳しくはパンフレット</w:t>
+                        </w:r>
+                        <w:r>
+                          <w:rPr>
+                            <w:rFonts w:ascii="IBM Plex Sans JP" w:eastAsia="IBM Plex Sans JP" w:hAnsi="IBM Plex Sans JP" w:hint="eastAsia"/>
+                            <w:color w:val="000000" w:themeColor="text1"/>
+                            <w:sz w:val="16"/>
+                            <w:szCs w:val="18"/>
+                          </w:rPr>
+                          <w:t>p.31</w:t>
+                        </w:r>
+                        <w:r>
+                          <w:rPr>
+                            <w:rFonts w:ascii="IBM Plex Sans JP" w:eastAsia="IBM Plex Sans JP" w:hAnsi="IBM Plex Sans JP" w:hint="eastAsia"/>
+                            <w:color w:val="000000" w:themeColor="text1"/>
+                            <w:sz w:val="16"/>
+                            <w:szCs w:val="18"/>
+                          </w:rPr>
+                          <w:t>を参照。</w:t>
                         </w:r>
                         <w:r>
                           <w:rPr>
@@ -10702,7 +11162,17 @@
                                   <w:szCs w:val="18"/>
                                   <w:lang w:eastAsia="zh-CN"/>
                                 </w:rPr>
-                                <w:t>V0.1.1</w:t>
+                                <w:t>V</w:t>
+                              </w:r>
+                              <w:r>
+                                <w:rPr>
+                                  <w:rFonts w:ascii="IBM Plex Sans JP" w:eastAsia="IBM Plex Sans JP" w:hAnsi="IBM Plex Sans JP"/>
+                                  <w:color w:val="000000" w:themeColor="text1"/>
+                                  <w:sz w:val="16"/>
+                                  <w:szCs w:val="18"/>
+                                  <w:lang w:eastAsia="zh-CN"/>
+                                </w:rPr>
+                                <w:t>1.1</w:t>
                               </w:r>
                               <w:r>
                                 <w:rPr>
@@ -10856,7 +11326,43 @@
                                   <w:sz w:val="16"/>
                                   <w:szCs w:val="18"/>
                                 </w:rPr>
-                                <w:t>投票の際は終了時刻にご注意ください。(詳しくはパンフレットを参照。</w:t>
+                                <w:t>投票の際は</w:t>
+                              </w:r>
+                              <w:r>
+                                <w:rPr>
+                                  <w:rFonts w:ascii="IBM Plex Sans JP" w:eastAsia="IBM Plex Sans JP" w:hAnsi="IBM Plex Sans JP" w:hint="eastAsia"/>
+                                  <w:color w:val="000000" w:themeColor="text1"/>
+                                  <w:sz w:val="16"/>
+                                  <w:szCs w:val="18"/>
+                                </w:rPr>
+                                <w:t>時刻</w:t>
+                              </w:r>
+                              <w:r>
+                                <w:rPr>
+                                  <w:rFonts w:ascii="IBM Plex Sans JP" w:eastAsia="IBM Plex Sans JP" w:hAnsi="IBM Plex Sans JP" w:hint="eastAsia"/>
+                                  <w:color w:val="000000" w:themeColor="text1"/>
+                                  <w:sz w:val="16"/>
+                                  <w:szCs w:val="18"/>
+                                </w:rPr>
+                                <w:t>にご注意ください。(詳しくはパンフレット</w:t>
+                              </w:r>
+                              <w:r>
+                                <w:rPr>
+                                  <w:rFonts w:ascii="IBM Plex Sans JP" w:eastAsia="IBM Plex Sans JP" w:hAnsi="IBM Plex Sans JP" w:hint="eastAsia"/>
+                                  <w:color w:val="000000" w:themeColor="text1"/>
+                                  <w:sz w:val="16"/>
+                                  <w:szCs w:val="18"/>
+                                </w:rPr>
+                                <w:t>p.31</w:t>
+                              </w:r>
+                              <w:r>
+                                <w:rPr>
+                                  <w:rFonts w:ascii="IBM Plex Sans JP" w:eastAsia="IBM Plex Sans JP" w:hAnsi="IBM Plex Sans JP" w:hint="eastAsia"/>
+                                  <w:color w:val="000000" w:themeColor="text1"/>
+                                  <w:sz w:val="16"/>
+                                  <w:szCs w:val="18"/>
+                                </w:rPr>
+                                <w:t>を参照。</w:t>
                               </w:r>
                               <w:r>
                                 <w:rPr>
@@ -10975,7 +11481,17 @@
                             <w:szCs w:val="18"/>
                             <w:lang w:eastAsia="zh-CN"/>
                           </w:rPr>
-                          <w:t>V0.1.1</w:t>
+                          <w:t>V</w:t>
+                        </w:r>
+                        <w:r>
+                          <w:rPr>
+                            <w:rFonts w:ascii="IBM Plex Sans JP" w:eastAsia="IBM Plex Sans JP" w:hAnsi="IBM Plex Sans JP"/>
+                            <w:color w:val="000000" w:themeColor="text1"/>
+                            <w:sz w:val="16"/>
+                            <w:szCs w:val="18"/>
+                            <w:lang w:eastAsia="zh-CN"/>
+                          </w:rPr>
+                          <w:t>1.1</w:t>
                         </w:r>
                         <w:r>
                           <w:rPr>
@@ -11108,7 +11624,43 @@
                             <w:sz w:val="16"/>
                             <w:szCs w:val="18"/>
                           </w:rPr>
-                          <w:t>投票の際は終了時刻にご注意ください。(詳しくはパンフレットを参照。</w:t>
+                          <w:t>投票の際は</w:t>
+                        </w:r>
+                        <w:r>
+                          <w:rPr>
+                            <w:rFonts w:ascii="IBM Plex Sans JP" w:eastAsia="IBM Plex Sans JP" w:hAnsi="IBM Plex Sans JP" w:hint="eastAsia"/>
+                            <w:color w:val="000000" w:themeColor="text1"/>
+                            <w:sz w:val="16"/>
+                            <w:szCs w:val="18"/>
+                          </w:rPr>
+                          <w:t>時刻</w:t>
+                        </w:r>
+                        <w:r>
+                          <w:rPr>
+                            <w:rFonts w:ascii="IBM Plex Sans JP" w:eastAsia="IBM Plex Sans JP" w:hAnsi="IBM Plex Sans JP" w:hint="eastAsia"/>
+                            <w:color w:val="000000" w:themeColor="text1"/>
+                            <w:sz w:val="16"/>
+                            <w:szCs w:val="18"/>
+                          </w:rPr>
+                          <w:t>にご注意ください。(詳しくはパンフレット</w:t>
+                        </w:r>
+                        <w:r>
+                          <w:rPr>
+                            <w:rFonts w:ascii="IBM Plex Sans JP" w:eastAsia="IBM Plex Sans JP" w:hAnsi="IBM Plex Sans JP" w:hint="eastAsia"/>
+                            <w:color w:val="000000" w:themeColor="text1"/>
+                            <w:sz w:val="16"/>
+                            <w:szCs w:val="18"/>
+                          </w:rPr>
+                          <w:t>p.31</w:t>
+                        </w:r>
+                        <w:r>
+                          <w:rPr>
+                            <w:rFonts w:ascii="IBM Plex Sans JP" w:eastAsia="IBM Plex Sans JP" w:hAnsi="IBM Plex Sans JP" w:hint="eastAsia"/>
+                            <w:color w:val="000000" w:themeColor="text1"/>
+                            <w:sz w:val="16"/>
+                            <w:szCs w:val="18"/>
+                          </w:rPr>
+                          <w:t>を参照。</w:t>
                         </w:r>
                         <w:r>
                           <w:rPr>
@@ -11322,7 +11874,17 @@
                                   <w:szCs w:val="18"/>
                                   <w:lang w:eastAsia="zh-CN"/>
                                 </w:rPr>
-                                <w:t>V0.1.1</w:t>
+                                <w:t>V</w:t>
+                              </w:r>
+                              <w:r>
+                                <w:rPr>
+                                  <w:rFonts w:ascii="IBM Plex Sans JP" w:eastAsia="IBM Plex Sans JP" w:hAnsi="IBM Plex Sans JP"/>
+                                  <w:color w:val="000000" w:themeColor="text1"/>
+                                  <w:sz w:val="16"/>
+                                  <w:szCs w:val="18"/>
+                                  <w:lang w:eastAsia="zh-CN"/>
+                                </w:rPr>
+                                <w:t>1.1</w:t>
                               </w:r>
                               <w:r>
                                 <w:rPr>
@@ -11476,7 +12038,43 @@
                                   <w:sz w:val="16"/>
                                   <w:szCs w:val="18"/>
                                 </w:rPr>
-                                <w:t>投票の際は終了時刻にご注意ください。(詳しくはパンフレットを参照。</w:t>
+                                <w:t>投票の際は</w:t>
+                              </w:r>
+                              <w:r>
+                                <w:rPr>
+                                  <w:rFonts w:ascii="IBM Plex Sans JP" w:eastAsia="IBM Plex Sans JP" w:hAnsi="IBM Plex Sans JP" w:hint="eastAsia"/>
+                                  <w:color w:val="000000" w:themeColor="text1"/>
+                                  <w:sz w:val="16"/>
+                                  <w:szCs w:val="18"/>
+                                </w:rPr>
+                                <w:t>時刻</w:t>
+                              </w:r>
+                              <w:r>
+                                <w:rPr>
+                                  <w:rFonts w:ascii="IBM Plex Sans JP" w:eastAsia="IBM Plex Sans JP" w:hAnsi="IBM Plex Sans JP" w:hint="eastAsia"/>
+                                  <w:color w:val="000000" w:themeColor="text1"/>
+                                  <w:sz w:val="16"/>
+                                  <w:szCs w:val="18"/>
+                                </w:rPr>
+                                <w:t>にご注意ください。(詳しくはパンフレット</w:t>
+                              </w:r>
+                              <w:r>
+                                <w:rPr>
+                                  <w:rFonts w:ascii="IBM Plex Sans JP" w:eastAsia="IBM Plex Sans JP" w:hAnsi="IBM Plex Sans JP" w:hint="eastAsia"/>
+                                  <w:color w:val="000000" w:themeColor="text1"/>
+                                  <w:sz w:val="16"/>
+                                  <w:szCs w:val="18"/>
+                                </w:rPr>
+                                <w:t>p.31</w:t>
+                              </w:r>
+                              <w:r>
+                                <w:rPr>
+                                  <w:rFonts w:ascii="IBM Plex Sans JP" w:eastAsia="IBM Plex Sans JP" w:hAnsi="IBM Plex Sans JP" w:hint="eastAsia"/>
+                                  <w:color w:val="000000" w:themeColor="text1"/>
+                                  <w:sz w:val="16"/>
+                                  <w:szCs w:val="18"/>
+                                </w:rPr>
+                                <w:t>を参照。</w:t>
                               </w:r>
                               <w:r>
                                 <w:rPr>
@@ -11595,7 +12193,17 @@
                             <w:szCs w:val="18"/>
                             <w:lang w:eastAsia="zh-CN"/>
                           </w:rPr>
-                          <w:t>V0.1.1</w:t>
+                          <w:t>V</w:t>
+                        </w:r>
+                        <w:r>
+                          <w:rPr>
+                            <w:rFonts w:ascii="IBM Plex Sans JP" w:eastAsia="IBM Plex Sans JP" w:hAnsi="IBM Plex Sans JP"/>
+                            <w:color w:val="000000" w:themeColor="text1"/>
+                            <w:sz w:val="16"/>
+                            <w:szCs w:val="18"/>
+                            <w:lang w:eastAsia="zh-CN"/>
+                          </w:rPr>
+                          <w:t>1.1</w:t>
                         </w:r>
                         <w:r>
                           <w:rPr>
@@ -11728,7 +12336,43 @@
                             <w:sz w:val="16"/>
                             <w:szCs w:val="18"/>
                           </w:rPr>
-                          <w:t>投票の際は終了時刻にご注意ください。(詳しくはパンフレットを参照。</w:t>
+                          <w:t>投票の際は</w:t>
+                        </w:r>
+                        <w:r>
+                          <w:rPr>
+                            <w:rFonts w:ascii="IBM Plex Sans JP" w:eastAsia="IBM Plex Sans JP" w:hAnsi="IBM Plex Sans JP" w:hint="eastAsia"/>
+                            <w:color w:val="000000" w:themeColor="text1"/>
+                            <w:sz w:val="16"/>
+                            <w:szCs w:val="18"/>
+                          </w:rPr>
+                          <w:t>時刻</w:t>
+                        </w:r>
+                        <w:r>
+                          <w:rPr>
+                            <w:rFonts w:ascii="IBM Plex Sans JP" w:eastAsia="IBM Plex Sans JP" w:hAnsi="IBM Plex Sans JP" w:hint="eastAsia"/>
+                            <w:color w:val="000000" w:themeColor="text1"/>
+                            <w:sz w:val="16"/>
+                            <w:szCs w:val="18"/>
+                          </w:rPr>
+                          <w:t>にご注意ください。(詳しくはパンフレット</w:t>
+                        </w:r>
+                        <w:r>
+                          <w:rPr>
+                            <w:rFonts w:ascii="IBM Plex Sans JP" w:eastAsia="IBM Plex Sans JP" w:hAnsi="IBM Plex Sans JP" w:hint="eastAsia"/>
+                            <w:color w:val="000000" w:themeColor="text1"/>
+                            <w:sz w:val="16"/>
+                            <w:szCs w:val="18"/>
+                          </w:rPr>
+                          <w:t>p.31</w:t>
+                        </w:r>
+                        <w:r>
+                          <w:rPr>
+                            <w:rFonts w:ascii="IBM Plex Sans JP" w:eastAsia="IBM Plex Sans JP" w:hAnsi="IBM Plex Sans JP" w:hint="eastAsia"/>
+                            <w:color w:val="000000" w:themeColor="text1"/>
+                            <w:sz w:val="16"/>
+                            <w:szCs w:val="18"/>
+                          </w:rPr>
+                          <w:t>を参照。</w:t>
                         </w:r>
                         <w:r>
                           <w:rPr>
@@ -11942,7 +12586,17 @@
                                   <w:szCs w:val="18"/>
                                   <w:lang w:eastAsia="zh-CN"/>
                                 </w:rPr>
-                                <w:t>V0.1.1</w:t>
+                                <w:t>V</w:t>
+                              </w:r>
+                              <w:r>
+                                <w:rPr>
+                                  <w:rFonts w:ascii="IBM Plex Sans JP" w:eastAsia="IBM Plex Sans JP" w:hAnsi="IBM Plex Sans JP"/>
+                                  <w:color w:val="000000" w:themeColor="text1"/>
+                                  <w:sz w:val="16"/>
+                                  <w:szCs w:val="18"/>
+                                  <w:lang w:eastAsia="zh-CN"/>
+                                </w:rPr>
+                                <w:t>1.1</w:t>
                               </w:r>
                               <w:r>
                                 <w:rPr>
@@ -12096,7 +12750,43 @@
                                   <w:sz w:val="16"/>
                                   <w:szCs w:val="18"/>
                                 </w:rPr>
-                                <w:t>投票の際は終了時刻にご注意ください。(詳しくはパンフレットを参照。</w:t>
+                                <w:t>投票の際は</w:t>
+                              </w:r>
+                              <w:r>
+                                <w:rPr>
+                                  <w:rFonts w:ascii="IBM Plex Sans JP" w:eastAsia="IBM Plex Sans JP" w:hAnsi="IBM Plex Sans JP" w:hint="eastAsia"/>
+                                  <w:color w:val="000000" w:themeColor="text1"/>
+                                  <w:sz w:val="16"/>
+                                  <w:szCs w:val="18"/>
+                                </w:rPr>
+                                <w:t>時刻</w:t>
+                              </w:r>
+                              <w:r>
+                                <w:rPr>
+                                  <w:rFonts w:ascii="IBM Plex Sans JP" w:eastAsia="IBM Plex Sans JP" w:hAnsi="IBM Plex Sans JP" w:hint="eastAsia"/>
+                                  <w:color w:val="000000" w:themeColor="text1"/>
+                                  <w:sz w:val="16"/>
+                                  <w:szCs w:val="18"/>
+                                </w:rPr>
+                                <w:t>にご注意ください。(詳しくはパンフレット</w:t>
+                              </w:r>
+                              <w:r>
+                                <w:rPr>
+                                  <w:rFonts w:ascii="IBM Plex Sans JP" w:eastAsia="IBM Plex Sans JP" w:hAnsi="IBM Plex Sans JP" w:hint="eastAsia"/>
+                                  <w:color w:val="000000" w:themeColor="text1"/>
+                                  <w:sz w:val="16"/>
+                                  <w:szCs w:val="18"/>
+                                </w:rPr>
+                                <w:t>p.31</w:t>
+                              </w:r>
+                              <w:r>
+                                <w:rPr>
+                                  <w:rFonts w:ascii="IBM Plex Sans JP" w:eastAsia="IBM Plex Sans JP" w:hAnsi="IBM Plex Sans JP" w:hint="eastAsia"/>
+                                  <w:color w:val="000000" w:themeColor="text1"/>
+                                  <w:sz w:val="16"/>
+                                  <w:szCs w:val="18"/>
+                                </w:rPr>
+                                <w:t>を参照。</w:t>
                               </w:r>
                               <w:r>
                                 <w:rPr>
@@ -12215,7 +12905,17 @@
                             <w:szCs w:val="18"/>
                             <w:lang w:eastAsia="zh-CN"/>
                           </w:rPr>
-                          <w:t>V0.1.1</w:t>
+                          <w:t>V</w:t>
+                        </w:r>
+                        <w:r>
+                          <w:rPr>
+                            <w:rFonts w:ascii="IBM Plex Sans JP" w:eastAsia="IBM Plex Sans JP" w:hAnsi="IBM Plex Sans JP"/>
+                            <w:color w:val="000000" w:themeColor="text1"/>
+                            <w:sz w:val="16"/>
+                            <w:szCs w:val="18"/>
+                            <w:lang w:eastAsia="zh-CN"/>
+                          </w:rPr>
+                          <w:t>1.1</w:t>
                         </w:r>
                         <w:r>
                           <w:rPr>
@@ -12348,7 +13048,43 @@
                             <w:sz w:val="16"/>
                             <w:szCs w:val="18"/>
                           </w:rPr>
-                          <w:t>投票の際は終了時刻にご注意ください。(詳しくはパンフレットを参照。</w:t>
+                          <w:t>投票の際は</w:t>
+                        </w:r>
+                        <w:r>
+                          <w:rPr>
+                            <w:rFonts w:ascii="IBM Plex Sans JP" w:eastAsia="IBM Plex Sans JP" w:hAnsi="IBM Plex Sans JP" w:hint="eastAsia"/>
+                            <w:color w:val="000000" w:themeColor="text1"/>
+                            <w:sz w:val="16"/>
+                            <w:szCs w:val="18"/>
+                          </w:rPr>
+                          <w:t>時刻</w:t>
+                        </w:r>
+                        <w:r>
+                          <w:rPr>
+                            <w:rFonts w:ascii="IBM Plex Sans JP" w:eastAsia="IBM Plex Sans JP" w:hAnsi="IBM Plex Sans JP" w:hint="eastAsia"/>
+                            <w:color w:val="000000" w:themeColor="text1"/>
+                            <w:sz w:val="16"/>
+                            <w:szCs w:val="18"/>
+                          </w:rPr>
+                          <w:t>にご注意ください。(詳しくはパンフレット</w:t>
+                        </w:r>
+                        <w:r>
+                          <w:rPr>
+                            <w:rFonts w:ascii="IBM Plex Sans JP" w:eastAsia="IBM Plex Sans JP" w:hAnsi="IBM Plex Sans JP" w:hint="eastAsia"/>
+                            <w:color w:val="000000" w:themeColor="text1"/>
+                            <w:sz w:val="16"/>
+                            <w:szCs w:val="18"/>
+                          </w:rPr>
+                          <w:t>p.31</w:t>
+                        </w:r>
+                        <w:r>
+                          <w:rPr>
+                            <w:rFonts w:ascii="IBM Plex Sans JP" w:eastAsia="IBM Plex Sans JP" w:hAnsi="IBM Plex Sans JP" w:hint="eastAsia"/>
+                            <w:color w:val="000000" w:themeColor="text1"/>
+                            <w:sz w:val="16"/>
+                            <w:szCs w:val="18"/>
+                          </w:rPr>
+                          <w:t>を参照。</w:t>
                         </w:r>
                         <w:r>
                           <w:rPr>
@@ -12562,7 +13298,17 @@
                                   <w:szCs w:val="18"/>
                                   <w:lang w:eastAsia="zh-CN"/>
                                 </w:rPr>
-                                <w:t>V0.1.1</w:t>
+                                <w:t>V</w:t>
+                              </w:r>
+                              <w:r>
+                                <w:rPr>
+                                  <w:rFonts w:ascii="IBM Plex Sans JP" w:eastAsia="IBM Plex Sans JP" w:hAnsi="IBM Plex Sans JP"/>
+                                  <w:color w:val="000000" w:themeColor="text1"/>
+                                  <w:sz w:val="16"/>
+                                  <w:szCs w:val="18"/>
+                                  <w:lang w:eastAsia="zh-CN"/>
+                                </w:rPr>
+                                <w:t>1.1</w:t>
                               </w:r>
                               <w:r>
                                 <w:rPr>
@@ -12716,7 +13462,43 @@
                                   <w:sz w:val="16"/>
                                   <w:szCs w:val="18"/>
                                 </w:rPr>
-                                <w:t>投票の際は終了時刻にご注意ください。(詳しくはパンフレットを参照。</w:t>
+                                <w:t>投票の際は</w:t>
+                              </w:r>
+                              <w:r>
+                                <w:rPr>
+                                  <w:rFonts w:ascii="IBM Plex Sans JP" w:eastAsia="IBM Plex Sans JP" w:hAnsi="IBM Plex Sans JP" w:hint="eastAsia"/>
+                                  <w:color w:val="000000" w:themeColor="text1"/>
+                                  <w:sz w:val="16"/>
+                                  <w:szCs w:val="18"/>
+                                </w:rPr>
+                                <w:t>時刻</w:t>
+                              </w:r>
+                              <w:r>
+                                <w:rPr>
+                                  <w:rFonts w:ascii="IBM Plex Sans JP" w:eastAsia="IBM Plex Sans JP" w:hAnsi="IBM Plex Sans JP" w:hint="eastAsia"/>
+                                  <w:color w:val="000000" w:themeColor="text1"/>
+                                  <w:sz w:val="16"/>
+                                  <w:szCs w:val="18"/>
+                                </w:rPr>
+                                <w:t>にご注意ください。(詳しくはパンフレット</w:t>
+                              </w:r>
+                              <w:r>
+                                <w:rPr>
+                                  <w:rFonts w:ascii="IBM Plex Sans JP" w:eastAsia="IBM Plex Sans JP" w:hAnsi="IBM Plex Sans JP" w:hint="eastAsia"/>
+                                  <w:color w:val="000000" w:themeColor="text1"/>
+                                  <w:sz w:val="16"/>
+                                  <w:szCs w:val="18"/>
+                                </w:rPr>
+                                <w:t>p.31</w:t>
+                              </w:r>
+                              <w:r>
+                                <w:rPr>
+                                  <w:rFonts w:ascii="IBM Plex Sans JP" w:eastAsia="IBM Plex Sans JP" w:hAnsi="IBM Plex Sans JP" w:hint="eastAsia"/>
+                                  <w:color w:val="000000" w:themeColor="text1"/>
+                                  <w:sz w:val="16"/>
+                                  <w:szCs w:val="18"/>
+                                </w:rPr>
+                                <w:t>を参照。</w:t>
                               </w:r>
                               <w:r>
                                 <w:rPr>
@@ -12835,7 +13617,17 @@
                             <w:szCs w:val="18"/>
                             <w:lang w:eastAsia="zh-CN"/>
                           </w:rPr>
-                          <w:t>V0.1.1</w:t>
+                          <w:t>V</w:t>
+                        </w:r>
+                        <w:r>
+                          <w:rPr>
+                            <w:rFonts w:ascii="IBM Plex Sans JP" w:eastAsia="IBM Plex Sans JP" w:hAnsi="IBM Plex Sans JP"/>
+                            <w:color w:val="000000" w:themeColor="text1"/>
+                            <w:sz w:val="16"/>
+                            <w:szCs w:val="18"/>
+                            <w:lang w:eastAsia="zh-CN"/>
+                          </w:rPr>
+                          <w:t>1.1</w:t>
                         </w:r>
                         <w:r>
                           <w:rPr>
@@ -12968,7 +13760,43 @@
                             <w:sz w:val="16"/>
                             <w:szCs w:val="18"/>
                           </w:rPr>
-                          <w:t>投票の際は終了時刻にご注意ください。(詳しくはパンフレットを参照。</w:t>
+                          <w:t>投票の際は</w:t>
+                        </w:r>
+                        <w:r>
+                          <w:rPr>
+                            <w:rFonts w:ascii="IBM Plex Sans JP" w:eastAsia="IBM Plex Sans JP" w:hAnsi="IBM Plex Sans JP" w:hint="eastAsia"/>
+                            <w:color w:val="000000" w:themeColor="text1"/>
+                            <w:sz w:val="16"/>
+                            <w:szCs w:val="18"/>
+                          </w:rPr>
+                          <w:t>時刻</w:t>
+                        </w:r>
+                        <w:r>
+                          <w:rPr>
+                            <w:rFonts w:ascii="IBM Plex Sans JP" w:eastAsia="IBM Plex Sans JP" w:hAnsi="IBM Plex Sans JP" w:hint="eastAsia"/>
+                            <w:color w:val="000000" w:themeColor="text1"/>
+                            <w:sz w:val="16"/>
+                            <w:szCs w:val="18"/>
+                          </w:rPr>
+                          <w:t>にご注意ください。(詳しくはパンフレット</w:t>
+                        </w:r>
+                        <w:r>
+                          <w:rPr>
+                            <w:rFonts w:ascii="IBM Plex Sans JP" w:eastAsia="IBM Plex Sans JP" w:hAnsi="IBM Plex Sans JP" w:hint="eastAsia"/>
+                            <w:color w:val="000000" w:themeColor="text1"/>
+                            <w:sz w:val="16"/>
+                            <w:szCs w:val="18"/>
+                          </w:rPr>
+                          <w:t>p.31</w:t>
+                        </w:r>
+                        <w:r>
+                          <w:rPr>
+                            <w:rFonts w:ascii="IBM Plex Sans JP" w:eastAsia="IBM Plex Sans JP" w:hAnsi="IBM Plex Sans JP" w:hint="eastAsia"/>
+                            <w:color w:val="000000" w:themeColor="text1"/>
+                            <w:sz w:val="16"/>
+                            <w:szCs w:val="18"/>
+                          </w:rPr>
+                          <w:t>を参照。</w:t>
                         </w:r>
                         <w:r>
                           <w:rPr>
@@ -13182,7 +14010,17 @@
                                   <w:szCs w:val="18"/>
                                   <w:lang w:eastAsia="zh-CN"/>
                                 </w:rPr>
-                                <w:t>V0.1.1</w:t>
+                                <w:t>V</w:t>
+                              </w:r>
+                              <w:r>
+                                <w:rPr>
+                                  <w:rFonts w:ascii="IBM Plex Sans JP" w:eastAsia="IBM Plex Sans JP" w:hAnsi="IBM Plex Sans JP"/>
+                                  <w:color w:val="000000" w:themeColor="text1"/>
+                                  <w:sz w:val="16"/>
+                                  <w:szCs w:val="18"/>
+                                  <w:lang w:eastAsia="zh-CN"/>
+                                </w:rPr>
+                                <w:t>1.1</w:t>
                               </w:r>
                               <w:r>
                                 <w:rPr>
@@ -13336,7 +14174,43 @@
                                   <w:sz w:val="16"/>
                                   <w:szCs w:val="18"/>
                                 </w:rPr>
-                                <w:t>投票の際は終了時刻にご注意ください。(詳しくはパンフレットを参照。</w:t>
+                                <w:t>投票の際は</w:t>
+                              </w:r>
+                              <w:r>
+                                <w:rPr>
+                                  <w:rFonts w:ascii="IBM Plex Sans JP" w:eastAsia="IBM Plex Sans JP" w:hAnsi="IBM Plex Sans JP" w:hint="eastAsia"/>
+                                  <w:color w:val="000000" w:themeColor="text1"/>
+                                  <w:sz w:val="16"/>
+                                  <w:szCs w:val="18"/>
+                                </w:rPr>
+                                <w:t>時刻</w:t>
+                              </w:r>
+                              <w:r>
+                                <w:rPr>
+                                  <w:rFonts w:ascii="IBM Plex Sans JP" w:eastAsia="IBM Plex Sans JP" w:hAnsi="IBM Plex Sans JP" w:hint="eastAsia"/>
+                                  <w:color w:val="000000" w:themeColor="text1"/>
+                                  <w:sz w:val="16"/>
+                                  <w:szCs w:val="18"/>
+                                </w:rPr>
+                                <w:t>にご注意ください。(詳しくはパンフレット</w:t>
+                              </w:r>
+                              <w:r>
+                                <w:rPr>
+                                  <w:rFonts w:ascii="IBM Plex Sans JP" w:eastAsia="IBM Plex Sans JP" w:hAnsi="IBM Plex Sans JP" w:hint="eastAsia"/>
+                                  <w:color w:val="000000" w:themeColor="text1"/>
+                                  <w:sz w:val="16"/>
+                                  <w:szCs w:val="18"/>
+                                </w:rPr>
+                                <w:t>p.31</w:t>
+                              </w:r>
+                              <w:r>
+                                <w:rPr>
+                                  <w:rFonts w:ascii="IBM Plex Sans JP" w:eastAsia="IBM Plex Sans JP" w:hAnsi="IBM Plex Sans JP" w:hint="eastAsia"/>
+                                  <w:color w:val="000000" w:themeColor="text1"/>
+                                  <w:sz w:val="16"/>
+                                  <w:szCs w:val="18"/>
+                                </w:rPr>
+                                <w:t>を参照。</w:t>
                               </w:r>
                               <w:r>
                                 <w:rPr>
@@ -13455,7 +14329,17 @@
                             <w:szCs w:val="18"/>
                             <w:lang w:eastAsia="zh-CN"/>
                           </w:rPr>
-                          <w:t>V0.1.1</w:t>
+                          <w:t>V</w:t>
+                        </w:r>
+                        <w:r>
+                          <w:rPr>
+                            <w:rFonts w:ascii="IBM Plex Sans JP" w:eastAsia="IBM Plex Sans JP" w:hAnsi="IBM Plex Sans JP"/>
+                            <w:color w:val="000000" w:themeColor="text1"/>
+                            <w:sz w:val="16"/>
+                            <w:szCs w:val="18"/>
+                            <w:lang w:eastAsia="zh-CN"/>
+                          </w:rPr>
+                          <w:t>1.1</w:t>
                         </w:r>
                         <w:r>
                           <w:rPr>
@@ -13588,7 +14472,43 @@
                             <w:sz w:val="16"/>
                             <w:szCs w:val="18"/>
                           </w:rPr>
-                          <w:t>投票の際は終了時刻にご注意ください。(詳しくはパンフレットを参照。</w:t>
+                          <w:t>投票の際は</w:t>
+                        </w:r>
+                        <w:r>
+                          <w:rPr>
+                            <w:rFonts w:ascii="IBM Plex Sans JP" w:eastAsia="IBM Plex Sans JP" w:hAnsi="IBM Plex Sans JP" w:hint="eastAsia"/>
+                            <w:color w:val="000000" w:themeColor="text1"/>
+                            <w:sz w:val="16"/>
+                            <w:szCs w:val="18"/>
+                          </w:rPr>
+                          <w:t>時刻</w:t>
+                        </w:r>
+                        <w:r>
+                          <w:rPr>
+                            <w:rFonts w:ascii="IBM Plex Sans JP" w:eastAsia="IBM Plex Sans JP" w:hAnsi="IBM Plex Sans JP" w:hint="eastAsia"/>
+                            <w:color w:val="000000" w:themeColor="text1"/>
+                            <w:sz w:val="16"/>
+                            <w:szCs w:val="18"/>
+                          </w:rPr>
+                          <w:t>にご注意ください。(詳しくはパンフレット</w:t>
+                        </w:r>
+                        <w:r>
+                          <w:rPr>
+                            <w:rFonts w:ascii="IBM Plex Sans JP" w:eastAsia="IBM Plex Sans JP" w:hAnsi="IBM Plex Sans JP" w:hint="eastAsia"/>
+                            <w:color w:val="000000" w:themeColor="text1"/>
+                            <w:sz w:val="16"/>
+                            <w:szCs w:val="18"/>
+                          </w:rPr>
+                          <w:t>p.31</w:t>
+                        </w:r>
+                        <w:r>
+                          <w:rPr>
+                            <w:rFonts w:ascii="IBM Plex Sans JP" w:eastAsia="IBM Plex Sans JP" w:hAnsi="IBM Plex Sans JP" w:hint="eastAsia"/>
+                            <w:color w:val="000000" w:themeColor="text1"/>
+                            <w:sz w:val="16"/>
+                            <w:szCs w:val="18"/>
+                          </w:rPr>
+                          <w:t>を参照。</w:t>
                         </w:r>
                         <w:r>
                           <w:rPr>
@@ -13802,7 +14722,17 @@
                                   <w:szCs w:val="18"/>
                                   <w:lang w:eastAsia="zh-CN"/>
                                 </w:rPr>
-                                <w:t>V0.1.1</w:t>
+                                <w:t>V</w:t>
+                              </w:r>
+                              <w:r>
+                                <w:rPr>
+                                  <w:rFonts w:ascii="IBM Plex Sans JP" w:eastAsia="IBM Plex Sans JP" w:hAnsi="IBM Plex Sans JP"/>
+                                  <w:color w:val="000000" w:themeColor="text1"/>
+                                  <w:sz w:val="16"/>
+                                  <w:szCs w:val="18"/>
+                                  <w:lang w:eastAsia="zh-CN"/>
+                                </w:rPr>
+                                <w:t>1.1</w:t>
                               </w:r>
                               <w:r>
                                 <w:rPr>
@@ -13956,7 +14886,43 @@
                                   <w:sz w:val="16"/>
                                   <w:szCs w:val="18"/>
                                 </w:rPr>
-                                <w:t>投票の際は終了時刻にご注意ください。(詳しくはパンフレットを参照。</w:t>
+                                <w:t>投票の際は</w:t>
+                              </w:r>
+                              <w:r>
+                                <w:rPr>
+                                  <w:rFonts w:ascii="IBM Plex Sans JP" w:eastAsia="IBM Plex Sans JP" w:hAnsi="IBM Plex Sans JP" w:hint="eastAsia"/>
+                                  <w:color w:val="000000" w:themeColor="text1"/>
+                                  <w:sz w:val="16"/>
+                                  <w:szCs w:val="18"/>
+                                </w:rPr>
+                                <w:t>時刻</w:t>
+                              </w:r>
+                              <w:r>
+                                <w:rPr>
+                                  <w:rFonts w:ascii="IBM Plex Sans JP" w:eastAsia="IBM Plex Sans JP" w:hAnsi="IBM Plex Sans JP" w:hint="eastAsia"/>
+                                  <w:color w:val="000000" w:themeColor="text1"/>
+                                  <w:sz w:val="16"/>
+                                  <w:szCs w:val="18"/>
+                                </w:rPr>
+                                <w:t>にご注意ください。(詳しくはパンフレット</w:t>
+                              </w:r>
+                              <w:r>
+                                <w:rPr>
+                                  <w:rFonts w:ascii="IBM Plex Sans JP" w:eastAsia="IBM Plex Sans JP" w:hAnsi="IBM Plex Sans JP" w:hint="eastAsia"/>
+                                  <w:color w:val="000000" w:themeColor="text1"/>
+                                  <w:sz w:val="16"/>
+                                  <w:szCs w:val="18"/>
+                                </w:rPr>
+                                <w:t>p.31</w:t>
+                              </w:r>
+                              <w:r>
+                                <w:rPr>
+                                  <w:rFonts w:ascii="IBM Plex Sans JP" w:eastAsia="IBM Plex Sans JP" w:hAnsi="IBM Plex Sans JP" w:hint="eastAsia"/>
+                                  <w:color w:val="000000" w:themeColor="text1"/>
+                                  <w:sz w:val="16"/>
+                                  <w:szCs w:val="18"/>
+                                </w:rPr>
+                                <w:t>を参照。</w:t>
                               </w:r>
                               <w:r>
                                 <w:rPr>
@@ -14075,7 +15041,17 @@
                             <w:szCs w:val="18"/>
                             <w:lang w:eastAsia="zh-CN"/>
                           </w:rPr>
-                          <w:t>V0.1.1</w:t>
+                          <w:t>V</w:t>
+                        </w:r>
+                        <w:r>
+                          <w:rPr>
+                            <w:rFonts w:ascii="IBM Plex Sans JP" w:eastAsia="IBM Plex Sans JP" w:hAnsi="IBM Plex Sans JP"/>
+                            <w:color w:val="000000" w:themeColor="text1"/>
+                            <w:sz w:val="16"/>
+                            <w:szCs w:val="18"/>
+                            <w:lang w:eastAsia="zh-CN"/>
+                          </w:rPr>
+                          <w:t>1.1</w:t>
                         </w:r>
                         <w:r>
                           <w:rPr>
@@ -14208,7 +15184,43 @@
                             <w:sz w:val="16"/>
                             <w:szCs w:val="18"/>
                           </w:rPr>
-                          <w:t>投票の際は終了時刻にご注意ください。(詳しくはパンフレットを参照。</w:t>
+                          <w:t>投票の際は</w:t>
+                        </w:r>
+                        <w:r>
+                          <w:rPr>
+                            <w:rFonts w:ascii="IBM Plex Sans JP" w:eastAsia="IBM Plex Sans JP" w:hAnsi="IBM Plex Sans JP" w:hint="eastAsia"/>
+                            <w:color w:val="000000" w:themeColor="text1"/>
+                            <w:sz w:val="16"/>
+                            <w:szCs w:val="18"/>
+                          </w:rPr>
+                          <w:t>時刻</w:t>
+                        </w:r>
+                        <w:r>
+                          <w:rPr>
+                            <w:rFonts w:ascii="IBM Plex Sans JP" w:eastAsia="IBM Plex Sans JP" w:hAnsi="IBM Plex Sans JP" w:hint="eastAsia"/>
+                            <w:color w:val="000000" w:themeColor="text1"/>
+                            <w:sz w:val="16"/>
+                            <w:szCs w:val="18"/>
+                          </w:rPr>
+                          <w:t>にご注意ください。(詳しくはパンフレット</w:t>
+                        </w:r>
+                        <w:r>
+                          <w:rPr>
+                            <w:rFonts w:ascii="IBM Plex Sans JP" w:eastAsia="IBM Plex Sans JP" w:hAnsi="IBM Plex Sans JP" w:hint="eastAsia"/>
+                            <w:color w:val="000000" w:themeColor="text1"/>
+                            <w:sz w:val="16"/>
+                            <w:szCs w:val="18"/>
+                          </w:rPr>
+                          <w:t>p.31</w:t>
+                        </w:r>
+                        <w:r>
+                          <w:rPr>
+                            <w:rFonts w:ascii="IBM Plex Sans JP" w:eastAsia="IBM Plex Sans JP" w:hAnsi="IBM Plex Sans JP" w:hint="eastAsia"/>
+                            <w:color w:val="000000" w:themeColor="text1"/>
+                            <w:sz w:val="16"/>
+                            <w:szCs w:val="18"/>
+                          </w:rPr>
+                          <w:t>を参照。</w:t>
                         </w:r>
                         <w:r>
                           <w:rPr>

</xml_diff>